<commit_message>
MAT 141S Week 2
</commit_message>
<xml_diff>
--- a/liberal_arts_math/workshop_assignments/week_2.docx
+++ b/liberal_arts_math/workshop_assignments/week_2.docx
@@ -56,55 +56,7 @@
             <w:rPr>
               <w:rFonts w:ascii="Cambria Math" w:hAnsi="Cambria Math"/>
             </w:rPr>
-            <m:t>=2</m:t>
-          </m:r>
-          <m:r>
-            <w:rPr>
-              <w:rFonts w:ascii="Cambria Math" w:hAnsi="Cambria Math"/>
-            </w:rPr>
-            <m:t>⋅</m:t>
-          </m:r>
-          <m:r>
-            <w:rPr>
-              <w:rFonts w:ascii="Cambria Math" w:hAnsi="Cambria Math"/>
-            </w:rPr>
-            <m:t>2</m:t>
-          </m:r>
-          <m:r>
-            <w:rPr>
-              <w:rFonts w:ascii="Cambria Math" w:hAnsi="Cambria Math"/>
-            </w:rPr>
-            <m:t>⋅</m:t>
-          </m:r>
-          <m:r>
-            <w:rPr>
-              <w:rFonts w:ascii="Cambria Math" w:hAnsi="Cambria Math"/>
-            </w:rPr>
-            <m:t>2</m:t>
-          </m:r>
-          <m:r>
-            <w:rPr>
-              <w:rFonts w:ascii="Cambria Math" w:hAnsi="Cambria Math"/>
-            </w:rPr>
-            <m:t>⋅</m:t>
-          </m:r>
-          <m:r>
-            <w:rPr>
-              <w:rFonts w:ascii="Cambria Math" w:hAnsi="Cambria Math"/>
-            </w:rPr>
-            <m:t>2</m:t>
-          </m:r>
-          <m:r>
-            <w:rPr>
-              <w:rFonts w:ascii="Cambria Math" w:hAnsi="Cambria Math"/>
-            </w:rPr>
-            <m:t>⋅</m:t>
-          </m:r>
-          <m:r>
-            <w:rPr>
-              <w:rFonts w:ascii="Cambria Math" w:hAnsi="Cambria Math"/>
-            </w:rPr>
-            <m:t>2=32</m:t>
+            <m:t>=2⋅2⋅2⋅2⋅2=32</m:t>
           </m:r>
         </m:oMath>
       </m:oMathPara>
@@ -135,10 +87,9 @@
       <w:pPr>
         <w:pStyle w:val="ListParagraph"/>
         <w:numPr>
-          <w:ilvl w:val="3"/>
-          <w:numId w:val="2"/>
+          <w:ilvl w:val="0"/>
+          <w:numId w:val="6"/>
         </w:numPr>
-        <w:ind w:left="360"/>
       </w:pPr>
       <w:r>
         <w:t>What were some issues you faced with your math classes this week?</w:t>
@@ -149,7 +100,7 @@
         <w:pStyle w:val="ListParagraph"/>
         <w:numPr>
           <w:ilvl w:val="0"/>
-          <w:numId w:val="2"/>
+          <w:numId w:val="6"/>
         </w:numPr>
       </w:pPr>
       <w:r>
@@ -161,7 +112,7 @@
         <w:pStyle w:val="ListParagraph"/>
         <w:numPr>
           <w:ilvl w:val="0"/>
-          <w:numId w:val="2"/>
+          <w:numId w:val="6"/>
         </w:numPr>
       </w:pPr>
       <w:r>
@@ -173,7 +124,7 @@
         <w:pStyle w:val="ListParagraph"/>
         <w:numPr>
           <w:ilvl w:val="1"/>
-          <w:numId w:val="2"/>
+          <w:numId w:val="6"/>
         </w:numPr>
       </w:pPr>
       <m:oMath>
@@ -210,7 +161,7 @@
         <w:pStyle w:val="ListParagraph"/>
         <w:numPr>
           <w:ilvl w:val="1"/>
-          <w:numId w:val="2"/>
+          <w:numId w:val="6"/>
         </w:numPr>
       </w:pPr>
       <m:oMath>
@@ -247,7 +198,7 @@
         <w:pStyle w:val="ListParagraph"/>
         <w:numPr>
           <w:ilvl w:val="1"/>
-          <w:numId w:val="2"/>
+          <w:numId w:val="6"/>
         </w:numPr>
       </w:pPr>
       <m:oMath>
@@ -284,7 +235,7 @@
         <w:pStyle w:val="ListParagraph"/>
         <w:numPr>
           <w:ilvl w:val="1"/>
-          <w:numId w:val="2"/>
+          <w:numId w:val="6"/>
         </w:numPr>
       </w:pPr>
       <m:oMath>
@@ -316,6 +267,122 @@
         </m:sSup>
       </m:oMath>
     </w:p>
+    <w:p>
+      <w:pPr>
+        <w:pStyle w:val="Heading2"/>
+      </w:pPr>
+      <w:r>
+        <w:t>Answer Key</w:t>
+      </w:r>
+    </w:p>
+    <w:p>
+      <w:pPr>
+        <w:pStyle w:val="ListParagraph"/>
+        <w:numPr>
+          <w:ilvl w:val="0"/>
+          <w:numId w:val="7"/>
+        </w:numPr>
+      </w:pPr>
+      <m:oMath>
+        <m:r>
+          <w:rPr>
+            <w:rFonts w:ascii="Cambria Math" w:hAnsi="Cambria Math"/>
+          </w:rPr>
+          <m:t>125</m:t>
+        </m:r>
+      </m:oMath>
+    </w:p>
+    <w:p>
+      <w:pPr>
+        <w:pStyle w:val="ListParagraph"/>
+        <w:numPr>
+          <w:ilvl w:val="0"/>
+          <w:numId w:val="7"/>
+        </w:numPr>
+      </w:pPr>
+      <m:oMath>
+        <m:r>
+          <w:rPr>
+            <w:rFonts w:ascii="Cambria Math" w:hAnsi="Cambria Math"/>
+          </w:rPr>
+          <m:t>2401</m:t>
+        </m:r>
+      </m:oMath>
+    </w:p>
+    <w:p>
+      <w:pPr>
+        <w:pStyle w:val="ListParagraph"/>
+        <w:numPr>
+          <w:ilvl w:val="0"/>
+          <w:numId w:val="7"/>
+        </w:numPr>
+      </w:pPr>
+      <w:r>
+        <w:rPr>
+          <w:rFonts w:eastAsiaTheme="minorEastAsia"/>
+        </w:rPr>
+        <w:t>2.48832</w:t>
+      </w:r>
+    </w:p>
+    <w:p>
+      <w:pPr>
+        <w:pStyle w:val="ListParagraph"/>
+        <w:numPr>
+          <w:ilvl w:val="0"/>
+          <w:numId w:val="7"/>
+        </w:numPr>
+      </w:pPr>
+      <w:r>
+        <w:rPr>
+          <w:rFonts w:eastAsiaTheme="minorEastAsia"/>
+        </w:rPr>
+        <w:t>2.01220</w:t>
+      </w:r>
+    </w:p>
+    <w:p>
+      <w:pPr>
+        <w:pStyle w:val="Heading2"/>
+      </w:pPr>
+      <w:r>
+        <w:t>Student Feedback Templates</w:t>
+      </w:r>
+    </w:p>
+    <w:p>
+      <w:r>
+        <w:t>#1 should be 125 (5^3 = 5*5*5 = 125)</w:t>
+      </w:r>
+    </w:p>
+    <w:p>
+      <w:r>
+        <w:t>#2 should be 2401 (7^4 = 7*7*7*7 = 2401)</w:t>
+      </w:r>
+    </w:p>
+    <w:p>
+      <w:r>
+        <w:t>#3 should be 2.48832 (1.2^5 = 1.2*1.2*1.2*1.2*1.2 = 2.48832. No rounding is required.)</w:t>
+      </w:r>
+    </w:p>
+    <w:p>
+      <w:r>
+        <w:t xml:space="preserve">#4 should be 2.01220 (Use a calculator for this one 1.06^12 = </w:t>
+      </w:r>
+      <w:r>
+        <w:t>2.012196471835550329409536</w:t>
+      </w:r>
+      <w:r>
+        <w:t>. Round to five decimal places by looking at the 6 next to the 9</w:t>
+      </w:r>
+      <w:r>
+        <w:t xml:space="preserve"> (2.012196…)</w:t>
+      </w:r>
+      <w:r>
+        <w:t>.</w:t>
+      </w:r>
+      <w:r>
+        <w:t xml:space="preserve"> Because 6 is five or higher, round the 9 up to “10” by rounding the 19 up to 20.)</w:t>
+      </w:r>
+    </w:p>
+    <w:p/>
     <w:p/>
     <w:sectPr>
       <w:pgSz w:w="12240" w:h="15840"/>
@@ -419,6 +486,92 @@
     </w:lvl>
   </w:abstractNum>
   <w:abstractNum w:abstractNumId="1" w15:restartNumberingAfterBreak="0">
+    <w:nsid w:val="23F06B12"/>
+    <w:multiLevelType w:val="hybridMultilevel"/>
+    <w:tmpl w:val="E2D0C256"/>
+    <w:lvl w:ilvl="0" w:tplc="04090019">
+      <w:start w:val="1"/>
+      <w:numFmt w:val="lowerLetter"/>
+      <w:lvlText w:val="%1."/>
+      <w:lvlJc w:val="left"/>
+      <w:pPr>
+        <w:ind w:left="720" w:hanging="360"/>
+      </w:pPr>
+    </w:lvl>
+    <w:lvl w:ilvl="1" w:tplc="04090019" w:tentative="1">
+      <w:start w:val="1"/>
+      <w:numFmt w:val="lowerLetter"/>
+      <w:lvlText w:val="%2."/>
+      <w:lvlJc w:val="left"/>
+      <w:pPr>
+        <w:ind w:left="1440" w:hanging="360"/>
+      </w:pPr>
+    </w:lvl>
+    <w:lvl w:ilvl="2" w:tplc="0409001B" w:tentative="1">
+      <w:start w:val="1"/>
+      <w:numFmt w:val="lowerRoman"/>
+      <w:lvlText w:val="%3."/>
+      <w:lvlJc w:val="right"/>
+      <w:pPr>
+        <w:ind w:left="2160" w:hanging="180"/>
+      </w:pPr>
+    </w:lvl>
+    <w:lvl w:ilvl="3" w:tplc="0409000F" w:tentative="1">
+      <w:start w:val="1"/>
+      <w:numFmt w:val="decimal"/>
+      <w:lvlText w:val="%4."/>
+      <w:lvlJc w:val="left"/>
+      <w:pPr>
+        <w:ind w:left="2880" w:hanging="360"/>
+      </w:pPr>
+    </w:lvl>
+    <w:lvl w:ilvl="4" w:tplc="04090019" w:tentative="1">
+      <w:start w:val="1"/>
+      <w:numFmt w:val="lowerLetter"/>
+      <w:lvlText w:val="%5."/>
+      <w:lvlJc w:val="left"/>
+      <w:pPr>
+        <w:ind w:left="3600" w:hanging="360"/>
+      </w:pPr>
+    </w:lvl>
+    <w:lvl w:ilvl="5" w:tplc="0409001B" w:tentative="1">
+      <w:start w:val="1"/>
+      <w:numFmt w:val="lowerRoman"/>
+      <w:lvlText w:val="%6."/>
+      <w:lvlJc w:val="right"/>
+      <w:pPr>
+        <w:ind w:left="4320" w:hanging="180"/>
+      </w:pPr>
+    </w:lvl>
+    <w:lvl w:ilvl="6" w:tplc="0409000F" w:tentative="1">
+      <w:start w:val="1"/>
+      <w:numFmt w:val="decimal"/>
+      <w:lvlText w:val="%7."/>
+      <w:lvlJc w:val="left"/>
+      <w:pPr>
+        <w:ind w:left="5040" w:hanging="360"/>
+      </w:pPr>
+    </w:lvl>
+    <w:lvl w:ilvl="7" w:tplc="04090019" w:tentative="1">
+      <w:start w:val="1"/>
+      <w:numFmt w:val="lowerLetter"/>
+      <w:lvlText w:val="%8."/>
+      <w:lvlJc w:val="left"/>
+      <w:pPr>
+        <w:ind w:left="5760" w:hanging="360"/>
+      </w:pPr>
+    </w:lvl>
+    <w:lvl w:ilvl="8" w:tplc="0409001B" w:tentative="1">
+      <w:start w:val="1"/>
+      <w:numFmt w:val="lowerRoman"/>
+      <w:lvlText w:val="%9."/>
+      <w:lvlJc w:val="right"/>
+      <w:pPr>
+        <w:ind w:left="6480" w:hanging="180"/>
+      </w:pPr>
+    </w:lvl>
+  </w:abstractNum>
+  <w:abstractNum w:abstractNumId="2" w15:restartNumberingAfterBreak="0">
     <w:nsid w:val="30BB362F"/>
     <w:multiLevelType w:val="hybridMultilevel"/>
     <w:tmpl w:val="F47E414E"/>
@@ -504,7 +657,7 @@
       </w:pPr>
     </w:lvl>
   </w:abstractNum>
-  <w:abstractNum w:abstractNumId="2" w15:restartNumberingAfterBreak="0">
+  <w:abstractNum w:abstractNumId="3" w15:restartNumberingAfterBreak="0">
     <w:nsid w:val="325101EE"/>
     <w:multiLevelType w:val="hybridMultilevel"/>
     <w:tmpl w:val="85E2B4E8"/>
@@ -593,7 +746,93 @@
       </w:pPr>
     </w:lvl>
   </w:abstractNum>
-  <w:abstractNum w:abstractNumId="3" w15:restartNumberingAfterBreak="0">
+  <w:abstractNum w:abstractNumId="4" w15:restartNumberingAfterBreak="0">
+    <w:nsid w:val="42DC470D"/>
+    <w:multiLevelType w:val="hybridMultilevel"/>
+    <w:tmpl w:val="F998DD3C"/>
+    <w:lvl w:ilvl="0" w:tplc="0409000F">
+      <w:start w:val="1"/>
+      <w:numFmt w:val="decimal"/>
+      <w:lvlText w:val="%1."/>
+      <w:lvlJc w:val="left"/>
+      <w:pPr>
+        <w:ind w:left="720" w:hanging="360"/>
+      </w:pPr>
+    </w:lvl>
+    <w:lvl w:ilvl="1" w:tplc="04090019">
+      <w:start w:val="1"/>
+      <w:numFmt w:val="lowerLetter"/>
+      <w:lvlText w:val="%2."/>
+      <w:lvlJc w:val="left"/>
+      <w:pPr>
+        <w:ind w:left="1440" w:hanging="360"/>
+      </w:pPr>
+    </w:lvl>
+    <w:lvl w:ilvl="2" w:tplc="0409001B" w:tentative="1">
+      <w:start w:val="1"/>
+      <w:numFmt w:val="lowerRoman"/>
+      <w:lvlText w:val="%3."/>
+      <w:lvlJc w:val="right"/>
+      <w:pPr>
+        <w:ind w:left="2160" w:hanging="180"/>
+      </w:pPr>
+    </w:lvl>
+    <w:lvl w:ilvl="3" w:tplc="0409000F" w:tentative="1">
+      <w:start w:val="1"/>
+      <w:numFmt w:val="decimal"/>
+      <w:lvlText w:val="%4."/>
+      <w:lvlJc w:val="left"/>
+      <w:pPr>
+        <w:ind w:left="2880" w:hanging="360"/>
+      </w:pPr>
+    </w:lvl>
+    <w:lvl w:ilvl="4" w:tplc="04090019" w:tentative="1">
+      <w:start w:val="1"/>
+      <w:numFmt w:val="lowerLetter"/>
+      <w:lvlText w:val="%5."/>
+      <w:lvlJc w:val="left"/>
+      <w:pPr>
+        <w:ind w:left="3600" w:hanging="360"/>
+      </w:pPr>
+    </w:lvl>
+    <w:lvl w:ilvl="5" w:tplc="0409001B" w:tentative="1">
+      <w:start w:val="1"/>
+      <w:numFmt w:val="lowerRoman"/>
+      <w:lvlText w:val="%6."/>
+      <w:lvlJc w:val="right"/>
+      <w:pPr>
+        <w:ind w:left="4320" w:hanging="180"/>
+      </w:pPr>
+    </w:lvl>
+    <w:lvl w:ilvl="6" w:tplc="0409000F" w:tentative="1">
+      <w:start w:val="1"/>
+      <w:numFmt w:val="decimal"/>
+      <w:lvlText w:val="%7."/>
+      <w:lvlJc w:val="left"/>
+      <w:pPr>
+        <w:ind w:left="5040" w:hanging="360"/>
+      </w:pPr>
+    </w:lvl>
+    <w:lvl w:ilvl="7" w:tplc="04090019" w:tentative="1">
+      <w:start w:val="1"/>
+      <w:numFmt w:val="lowerLetter"/>
+      <w:lvlText w:val="%8."/>
+      <w:lvlJc w:val="left"/>
+      <w:pPr>
+        <w:ind w:left="5760" w:hanging="360"/>
+      </w:pPr>
+    </w:lvl>
+    <w:lvl w:ilvl="8" w:tplc="0409001B" w:tentative="1">
+      <w:start w:val="1"/>
+      <w:numFmt w:val="lowerRoman"/>
+      <w:lvlText w:val="%9."/>
+      <w:lvlJc w:val="right"/>
+      <w:pPr>
+        <w:ind w:left="6480" w:hanging="180"/>
+      </w:pPr>
+    </w:lvl>
+  </w:abstractNum>
+  <w:abstractNum w:abstractNumId="5" w15:restartNumberingAfterBreak="0">
     <w:nsid w:val="4BCA5B90"/>
     <w:multiLevelType w:val="hybridMultilevel"/>
     <w:tmpl w:val="B99C2B76"/>
@@ -679,7 +918,7 @@
       </w:pPr>
     </w:lvl>
   </w:abstractNum>
-  <w:abstractNum w:abstractNumId="4" w15:restartNumberingAfterBreak="0">
+  <w:abstractNum w:abstractNumId="6" w15:restartNumberingAfterBreak="0">
     <w:nsid w:val="6D9D6A46"/>
     <w:multiLevelType w:val="hybridMultilevel"/>
     <w:tmpl w:val="A7E6A5AE"/>
@@ -768,20 +1007,118 @@
       </w:pPr>
     </w:lvl>
   </w:abstractNum>
+  <w:abstractNum w:abstractNumId="7" w15:restartNumberingAfterBreak="0">
+    <w:nsid w:val="7335025A"/>
+    <w:multiLevelType w:val="hybridMultilevel"/>
+    <w:tmpl w:val="3C0059C0"/>
+    <w:lvl w:ilvl="0" w:tplc="04090019">
+      <w:start w:val="1"/>
+      <w:numFmt w:val="lowerLetter"/>
+      <w:lvlText w:val="%1."/>
+      <w:lvlJc w:val="left"/>
+      <w:pPr>
+        <w:ind w:left="720" w:hanging="360"/>
+      </w:pPr>
+      <w:rPr>
+        <w:rFonts w:hint="default"/>
+      </w:rPr>
+    </w:lvl>
+    <w:lvl w:ilvl="1" w:tplc="04090019" w:tentative="1">
+      <w:start w:val="1"/>
+      <w:numFmt w:val="lowerLetter"/>
+      <w:lvlText w:val="%2."/>
+      <w:lvlJc w:val="left"/>
+      <w:pPr>
+        <w:ind w:left="1440" w:hanging="360"/>
+      </w:pPr>
+    </w:lvl>
+    <w:lvl w:ilvl="2" w:tplc="0409001B" w:tentative="1">
+      <w:start w:val="1"/>
+      <w:numFmt w:val="lowerRoman"/>
+      <w:lvlText w:val="%3."/>
+      <w:lvlJc w:val="right"/>
+      <w:pPr>
+        <w:ind w:left="2160" w:hanging="180"/>
+      </w:pPr>
+    </w:lvl>
+    <w:lvl w:ilvl="3" w:tplc="0409000F" w:tentative="1">
+      <w:start w:val="1"/>
+      <w:numFmt w:val="decimal"/>
+      <w:lvlText w:val="%4."/>
+      <w:lvlJc w:val="left"/>
+      <w:pPr>
+        <w:ind w:left="2880" w:hanging="360"/>
+      </w:pPr>
+    </w:lvl>
+    <w:lvl w:ilvl="4" w:tplc="04090019" w:tentative="1">
+      <w:start w:val="1"/>
+      <w:numFmt w:val="lowerLetter"/>
+      <w:lvlText w:val="%5."/>
+      <w:lvlJc w:val="left"/>
+      <w:pPr>
+        <w:ind w:left="3600" w:hanging="360"/>
+      </w:pPr>
+    </w:lvl>
+    <w:lvl w:ilvl="5" w:tplc="0409001B" w:tentative="1">
+      <w:start w:val="1"/>
+      <w:numFmt w:val="lowerRoman"/>
+      <w:lvlText w:val="%6."/>
+      <w:lvlJc w:val="right"/>
+      <w:pPr>
+        <w:ind w:left="4320" w:hanging="180"/>
+      </w:pPr>
+    </w:lvl>
+    <w:lvl w:ilvl="6" w:tplc="0409000F" w:tentative="1">
+      <w:start w:val="1"/>
+      <w:numFmt w:val="decimal"/>
+      <w:lvlText w:val="%7."/>
+      <w:lvlJc w:val="left"/>
+      <w:pPr>
+        <w:ind w:left="5040" w:hanging="360"/>
+      </w:pPr>
+    </w:lvl>
+    <w:lvl w:ilvl="7" w:tplc="04090019" w:tentative="1">
+      <w:start w:val="1"/>
+      <w:numFmt w:val="lowerLetter"/>
+      <w:lvlText w:val="%8."/>
+      <w:lvlJc w:val="left"/>
+      <w:pPr>
+        <w:ind w:left="5760" w:hanging="360"/>
+      </w:pPr>
+    </w:lvl>
+    <w:lvl w:ilvl="8" w:tplc="0409001B" w:tentative="1">
+      <w:start w:val="1"/>
+      <w:numFmt w:val="lowerRoman"/>
+      <w:lvlText w:val="%9."/>
+      <w:lvlJc w:val="right"/>
+      <w:pPr>
+        <w:ind w:left="6480" w:hanging="180"/>
+      </w:pPr>
+    </w:lvl>
+  </w:abstractNum>
   <w:num w:numId="1" w16cid:durableId="1646087795">
+    <w:abstractNumId w:val="5"/>
+  </w:num>
+  <w:num w:numId="2" w16cid:durableId="1589577423">
     <w:abstractNumId w:val="3"/>
   </w:num>
-  <w:num w:numId="2" w16cid:durableId="1589577423">
+  <w:num w:numId="3" w16cid:durableId="226886403">
     <w:abstractNumId w:val="2"/>
-  </w:num>
-  <w:num w:numId="3" w16cid:durableId="226886403">
-    <w:abstractNumId w:val="1"/>
   </w:num>
   <w:num w:numId="4" w16cid:durableId="1732188975">
     <w:abstractNumId w:val="0"/>
   </w:num>
   <w:num w:numId="5" w16cid:durableId="138544951">
+    <w:abstractNumId w:val="6"/>
+  </w:num>
+  <w:num w:numId="6" w16cid:durableId="333458202">
     <w:abstractNumId w:val="4"/>
+  </w:num>
+  <w:num w:numId="7" w16cid:durableId="1010452518">
+    <w:abstractNumId w:val="1"/>
+  </w:num>
+  <w:num w:numId="8" w16cid:durableId="55052422">
+    <w:abstractNumId w:val="7"/>
   </w:num>
 </w:numbering>
 </file>
@@ -1388,6 +1725,7 @@
   <w:style w:type="character" w:default="1" w:styleId="DefaultParagraphFont">
     <w:name w:val="Default Paragraph Font"/>
     <w:uiPriority w:val="1"/>
+    <w:semiHidden/>
     <w:unhideWhenUsed/>
   </w:style>
   <w:style w:type="table" w:default="1" w:styleId="TableNormal">
@@ -1698,6 +2036,16 @@
       <w:smallCaps/>
       <w:color w:val="0F4761" w:themeColor="accent1" w:themeShade="BF"/>
       <w:spacing w:val="5"/>
+    </w:rPr>
+  </w:style>
+  <w:style w:type="character" w:styleId="PlaceholderText">
+    <w:name w:val="Placeholder Text"/>
+    <w:basedOn w:val="DefaultParagraphFont"/>
+    <w:uiPriority w:val="99"/>
+    <w:semiHidden/>
+    <w:rsid w:val="004902FF"/>
+    <w:rPr>
+      <w:color w:val="666666"/>
     </w:rPr>
   </w:style>
 </w:styles>

</xml_diff>